<commit_message>
fix : bouton install toujours visible, instructions adaptées par navigateur
</commit_message>
<xml_diff>
--- a/street_marpst.docx
+++ b/street_marpst.docx
@@ -12,29 +12,7 @@
         <w:rPr>
           <w:lang w:val="en-US"/>
         </w:rPr>
-        <w:t xml:space="preserve">Project </w:t>
-      </w:r>
-      <w:proofErr w:type="spellStart"/>
-      <w:proofErr w:type="gramStart"/>
-      <w:r>
-        <w:rPr>
-          <w:lang w:val="en-US"/>
-        </w:rPr>
-        <w:t>url</w:t>
-      </w:r>
-      <w:proofErr w:type="spellEnd"/>
-      <w:r>
-        <w:rPr>
-          <w:lang w:val="en-US"/>
-        </w:rPr>
-        <w:t> :</w:t>
-      </w:r>
-      <w:proofErr w:type="gramEnd"/>
-      <w:r>
-        <w:rPr>
-          <w:lang w:val="en-US"/>
-        </w:rPr>
-        <w:t xml:space="preserve"> </w:t>
+        <w:t xml:space="preserve">Project url : </w:t>
       </w:r>
       <w:hyperlink r:id="rId4" w:history="1">
         <w:r>
@@ -56,21 +34,7 @@
         <w:rPr>
           <w:lang w:val="en-US"/>
         </w:rPr>
-        <w:t xml:space="preserve">Anon </w:t>
-      </w:r>
-      <w:proofErr w:type="gramStart"/>
-      <w:r>
-        <w:rPr>
-          <w:lang w:val="en-US"/>
-        </w:rPr>
-        <w:t>key :</w:t>
-      </w:r>
-      <w:proofErr w:type="gramEnd"/>
-      <w:r>
-        <w:rPr>
-          <w:lang w:val="en-US"/>
-        </w:rPr>
-        <w:t xml:space="preserve"> </w:t>
+        <w:t xml:space="preserve">Anon key : </w:t>
       </w:r>
       <w:r>
         <w:rPr>
@@ -92,42 +56,18 @@
           <w:lang w:val="en-US"/>
         </w:rPr>
       </w:pPr>
-      <w:proofErr w:type="spellStart"/>
       <w:r>
         <w:rPr>
           <w:lang w:val="en-US"/>
         </w:rPr>
-        <w:t>Cloudinary</w:t>
+        <w:t xml:space="preserve">Cloudinary name : </w:t>
       </w:r>
-      <w:proofErr w:type="spellEnd"/>
-      <w:r>
-        <w:rPr>
-          <w:lang w:val="en-US"/>
-        </w:rPr>
-        <w:t xml:space="preserve"> </w:t>
-      </w:r>
-      <w:proofErr w:type="gramStart"/>
-      <w:r>
-        <w:rPr>
-          <w:lang w:val="en-US"/>
-        </w:rPr>
-        <w:t>name :</w:t>
-      </w:r>
-      <w:proofErr w:type="gramEnd"/>
-      <w:r>
-        <w:rPr>
-          <w:lang w:val="en-US"/>
-        </w:rPr>
-        <w:t xml:space="preserve"> </w:t>
-      </w:r>
-      <w:proofErr w:type="spellStart"/>
       <w:r>
         <w:rPr>
           <w:lang w:val="en-US"/>
         </w:rPr>
         <w:t>dcovuexex</w:t>
       </w:r>
-      <w:proofErr w:type="spellEnd"/>
     </w:p>
     <w:p>
       <w:pPr>
@@ -171,43 +111,18 @@
       </w:pPr>
     </w:p>
     <w:p>
-      <w:proofErr w:type="gramStart"/>
       <w:r>
-        <w:t>git</w:t>
+        <w:t>git init</w:t>
       </w:r>
-      <w:proofErr w:type="gramEnd"/>
+    </w:p>
+    <w:p>
       <w:r>
-        <w:t xml:space="preserve"> init</w:t>
+        <w:t>git add .</w:t>
       </w:r>
     </w:p>
     <w:p>
-      <w:proofErr w:type="gramStart"/>
       <w:r>
-        <w:t>git</w:t>
-      </w:r>
-      <w:proofErr w:type="gramEnd"/>
-      <w:r>
-        <w:t xml:space="preserve"> </w:t>
-      </w:r>
-      <w:proofErr w:type="spellStart"/>
-      <w:proofErr w:type="gramStart"/>
-      <w:r>
-        <w:t>add</w:t>
-      </w:r>
-      <w:proofErr w:type="spellEnd"/>
-      <w:r>
-        <w:t xml:space="preserve"> .</w:t>
-      </w:r>
-      <w:proofErr w:type="gramEnd"/>
-    </w:p>
-    <w:p>
-      <w:proofErr w:type="gramStart"/>
-      <w:r>
-        <w:t>git</w:t>
-      </w:r>
-      <w:proofErr w:type="gramEnd"/>
-      <w:r>
-        <w:t xml:space="preserve"> commit -m "init : carte des tags"</w:t>
+        <w:t>git commit -m "init : carte des tags"</w:t>
       </w:r>
     </w:p>
     <w:p>
@@ -288,11 +203,48 @@
           <w:lang w:val="en-US"/>
         </w:rPr>
       </w:pPr>
+      <w:hyperlink r:id="rId5" w:history="1">
+        <w:r>
+          <w:rPr>
+            <w:rStyle w:val="Lienhypertexte"/>
+            <w:lang w:val="en-US"/>
+          </w:rPr>
+          <w:t>https://street-marpst.vercel.app/</w:t>
+        </w:r>
+      </w:hyperlink>
+    </w:p>
+    <w:p>
+      <w:pPr>
+        <w:rPr>
+          <w:lang w:val="en-US"/>
+        </w:rPr>
+      </w:pPr>
+    </w:p>
+    <w:p>
+      <w:pPr>
+        <w:rPr>
+          <w:lang w:val="en-US"/>
+        </w:rPr>
+      </w:pPr>
+    </w:p>
+    <w:p>
+      <w:pPr>
+        <w:rPr>
+          <w:lang w:val="en-US"/>
+        </w:rPr>
+      </w:pPr>
+    </w:p>
+    <w:p>
+      <w:pPr>
+        <w:rPr>
+          <w:lang w:val="en-US"/>
+        </w:rPr>
+      </w:pPr>
       <w:r>
         <w:rPr>
           <w:lang w:val="en-US"/>
         </w:rPr>
-        <w:t>https://street-marpst.vercel.app/</w:t>
+        <w:t>Auuuvoleuuur1725</w:t>
       </w:r>
     </w:p>
     <w:sectPr>
@@ -908,6 +860,7 @@
   <w:style w:type="character" w:default="1" w:styleId="Policepardfaut">
     <w:name w:val="Default Paragraph Font"/>
     <w:uiPriority w:val="1"/>
+    <w:semiHidden/>
     <w:unhideWhenUsed/>
   </w:style>
   <w:style w:type="table" w:default="1" w:styleId="TableauNormal">

</xml_diff>